<commit_message>
preparando la aplicacion para el empaquetado.
</commit_message>
<xml_diff>
--- a/documentacion/provisional_DocumentacionProyecto_2VIFC302.docx
+++ b/documentacion/provisional_DocumentacionProyecto_2VIFC302.docx
@@ -1218,7 +1218,7 @@
           <w:lang w:eastAsia="es-VE"/>
         </w:rPr>
         <w:drawing>
-          <wp:inline distT="0" distB="0" distL="0" distR="0" wp14:anchorId="1183C0B2" wp14:editId="4CCE4C89">
+          <wp:inline distT="0" distB="0" distL="0" distR="0" wp14:anchorId="1183C0B2" wp14:editId="09ED0D3B">
             <wp:extent cx="7556500" cy="10599420"/>
             <wp:effectExtent l="0" t="0" r="6350" b="0"/>
             <wp:docPr id="2" name="Imagen 2" descr="D:\servicios forobeta posts\diseño grafico\CLIENTES\Feelmusic - 05.11.18\archivos\11\11.jpg"/>
@@ -1550,21 +1550,7 @@
                 <w:rStyle w:val="Hipervnculo"/>
                 <w:noProof/>
               </w:rPr>
-              <w:t>OBJETIVO GENE</w:t>
-            </w:r>
-            <w:r>
-              <w:rPr>
-                <w:rStyle w:val="Hipervnculo"/>
-                <w:noProof/>
-              </w:rPr>
-              <w:t>R</w:t>
-            </w:r>
-            <w:r>
-              <w:rPr>
-                <w:rStyle w:val="Hipervnculo"/>
-                <w:noProof/>
-              </w:rPr>
-              <w:t>AL DEL PROYECTO</w:t>
+              <w:t>OBJETIVO GENERAL DEL PROYECTO</w:t>
             </w:r>
             <w:r>
               <w:rPr>
@@ -10962,9 +10948,9 @@
         </w:rPr>
         <w:lastRenderedPageBreak/>
         <w:drawing>
-          <wp:inline distT="0" distB="0" distL="0" distR="0" wp14:anchorId="4333422A" wp14:editId="1785D7DB">
-            <wp:extent cx="3673928" cy="4029328"/>
-            <wp:effectExtent l="0" t="0" r="3175" b="0"/>
+          <wp:inline distT="0" distB="0" distL="0" distR="0" wp14:anchorId="4333422A" wp14:editId="31360F02">
+            <wp:extent cx="1837907" cy="4063217"/>
+            <wp:effectExtent l="0" t="0" r="0" b="0"/>
             <wp:docPr id="58759575" name="Imagen 3"/>
             <wp:cNvGraphicFramePr>
               <a:graphicFrameLocks xmlns:a="http://schemas.openxmlformats.org/drawingml/2006/main" noChangeAspect="1"/>
@@ -10991,7 +10977,7 @@
                   <pic:spPr>
                     <a:xfrm>
                       <a:off x="0" y="0"/>
-                      <a:ext cx="3704828" cy="4063217"/>
+                      <a:ext cx="1837907" cy="4063217"/>
                     </a:xfrm>
                     <a:prstGeom prst="rect">
                       <a:avLst/>
@@ -11037,9 +11023,9 @@
           <w:noProof/>
         </w:rPr>
         <w:drawing>
-          <wp:inline distT="0" distB="0" distL="0" distR="0" wp14:anchorId="6C646993" wp14:editId="36824A89">
-            <wp:extent cx="3401545" cy="3920128"/>
-            <wp:effectExtent l="0" t="0" r="8890" b="4445"/>
+          <wp:inline distT="0" distB="0" distL="0" distR="0" wp14:anchorId="6C646993" wp14:editId="5128F2A0">
+            <wp:extent cx="1809894" cy="3946163"/>
+            <wp:effectExtent l="0" t="0" r="0" b="0"/>
             <wp:docPr id="1157977682" name="Imagen 3"/>
             <wp:cNvGraphicFramePr>
               <a:graphicFrameLocks xmlns:a="http://schemas.openxmlformats.org/drawingml/2006/main" noChangeAspect="1"/>
@@ -11066,7 +11052,7 @@
                   <pic:spPr>
                     <a:xfrm>
                       <a:off x="0" y="0"/>
-                      <a:ext cx="3424136" cy="3946163"/>
+                      <a:ext cx="1809894" cy="3946163"/>
                     </a:xfrm>
                     <a:prstGeom prst="rect">
                       <a:avLst/>
@@ -11183,9 +11169,9 @@
           <w:noProof/>
         </w:rPr>
         <w:drawing>
-          <wp:inline distT="0" distB="0" distL="0" distR="0" wp14:anchorId="041199A3" wp14:editId="5E9093F5">
-            <wp:extent cx="6494137" cy="4870602"/>
-            <wp:effectExtent l="0" t="0" r="2540" b="6350"/>
+          <wp:inline distT="0" distB="0" distL="0" distR="0" wp14:anchorId="041199A3" wp14:editId="6753839D">
+            <wp:extent cx="6494137" cy="3652952"/>
+            <wp:effectExtent l="0" t="0" r="2540" b="5080"/>
             <wp:docPr id="963767397" name="Imagen 6"/>
             <wp:cNvGraphicFramePr>
               <a:graphicFrameLocks xmlns:a="http://schemas.openxmlformats.org/drawingml/2006/main" noChangeAspect="1"/>
@@ -11200,7 +11186,7 @@
                     </pic:cNvPicPr>
                   </pic:nvPicPr>
                   <pic:blipFill>
-                    <a:blip r:embed="rId26">
+                    <a:blip r:embed="rId26" cstate="print">
                       <a:extLst>
                         <a:ext uri="{28A0092B-C50C-407E-A947-70E740481C1C}">
                           <a14:useLocalDpi xmlns:a14="http://schemas.microsoft.com/office/drawing/2010/main" val="0"/>
@@ -11214,7 +11200,7 @@
                   <pic:spPr bwMode="auto">
                     <a:xfrm>
                       <a:off x="0" y="0"/>
-                      <a:ext cx="6494137" cy="4870602"/>
+                      <a:ext cx="6494137" cy="3652952"/>
                     </a:xfrm>
                     <a:prstGeom prst="rect">
                       <a:avLst/>
@@ -11256,30 +11242,27 @@
     <w:p>
       <w:pPr>
         <w:pStyle w:val="Prrafodelista"/>
-      </w:pPr>
+        <w:rPr>
+          <w:sz w:val="20"/>
+          <w:szCs w:val="20"/>
+        </w:rPr>
+      </w:pPr>
+      <w:r>
+        <w:rPr>
+          <w:sz w:val="20"/>
+          <w:szCs w:val="20"/>
+        </w:rPr>
+        <w:t>Cada pantalla de gestión dispondrá de un botón “volver” que regresará a la pantalla con el menú propio de cada rol. Además, cada pantalla con menú “de rol” lateral, tendrá un acceso directo a cada sección y botón de “Cerrar sesión”.</w:t>
+      </w:r>
     </w:p>
     <w:p>
       <w:pPr>
         <w:pStyle w:val="Prrafodelista"/>
-      </w:pPr>
-      <w:r>
-        <w:t xml:space="preserve">Cada pantalla de gestión dispondrá de un botón “volver” que regresará a la pantalla con el menú propio de cada rol. Además, cada pantalla con </w:t>
-      </w:r>
-      <w:r>
-        <w:t xml:space="preserve">menú </w:t>
-      </w:r>
-      <w:r>
-        <w:t xml:space="preserve">“de rol” </w:t>
-      </w:r>
-      <w:r>
-        <w:t>lateral</w:t>
-      </w:r>
-      <w:r>
-        <w:t xml:space="preserve">, tendrá un </w:t>
-      </w:r>
-      <w:r>
-        <w:t>acceso directo a cada sección y botón de “Cerrar sesión”.</w:t>
-      </w:r>
+        <w:rPr>
+          <w:sz w:val="20"/>
+          <w:szCs w:val="20"/>
+        </w:rPr>
+      </w:pPr>
     </w:p>
     <w:p>
       <w:pPr>
@@ -11296,18 +11279,13 @@
       </w:pPr>
       <w:bookmarkStart w:id="41" w:name="_Toc230268525"/>
       <w:r>
-        <w:lastRenderedPageBreak/>
         <w:t>PLAN DE PRUEBAS</w:t>
       </w:r>
       <w:bookmarkEnd w:id="41"/>
     </w:p>
     <w:p>
       <w:r>
-        <w:t xml:space="preserve">El plan de pruebas del proyecto se recoge en un documento independiente adjunto a esta documentación. En él se define la estrategia de pruebas seguida, los tipos de pruebas realizadas y los casos de prueba concretos con sus resultados. Las pruebas contemplan los </w:t>
-      </w:r>
-      <w:proofErr w:type="gramStart"/>
-      <w:r>
-        <w:t xml:space="preserve">niveles </w:t>
+        <w:t xml:space="preserve">El plan de pruebas del proyecto se recoge en un documento independiente adjunto a esta documentación. En él se define la estrategia de pruebas seguida, los tipos de pruebas realizadas y los casos de prueba concretos con sus resultados. Las pruebas contemplan los niveles </w:t>
       </w:r>
       <w:r>
         <w:rPr>
@@ -11316,7 +11294,6 @@
         </w:rPr>
         <w:t>unitario</w:t>
       </w:r>
-      <w:proofErr w:type="gramEnd"/>
       <w:r>
         <w:t xml:space="preserve">, de </w:t>
       </w:r>
@@ -11361,6 +11338,7 @@
       </w:pPr>
       <w:bookmarkStart w:id="42" w:name="_Toc230268526"/>
       <w:r>
+        <w:lastRenderedPageBreak/>
         <w:t>TECNOLOGÍAS EMPLEADAS</w:t>
       </w:r>
       <w:bookmarkEnd w:id="42"/>
@@ -11760,7 +11738,6 @@
           <w:b/>
           <w:bCs/>
         </w:rPr>
-        <w:lastRenderedPageBreak/>
         <w:t>JavaFX:</w:t>
       </w:r>
       <w:r>
@@ -11856,6 +11833,7 @@
       </w:pPr>
       <w:bookmarkStart w:id="43" w:name="_Toc230268527"/>
       <w:r>
+        <w:lastRenderedPageBreak/>
         <w:t>PLANIFICACIÓN Y PRESUPUESTO</w:t>
       </w:r>
       <w:bookmarkEnd w:id="43"/>
@@ -12101,7 +12079,6 @@
           </w:tcPr>
           <w:p>
             <w:r>
-              <w:lastRenderedPageBreak/>
               <w:t>Concepto</w:t>
             </w:r>
           </w:p>
@@ -12841,7 +12818,6 @@
         <w:ind w:firstLine="708"/>
       </w:pPr>
       <w:r>
-        <w:lastRenderedPageBreak/>
         <w:t xml:space="preserve"> </w:t>
       </w:r>
       <w:r>
@@ -12898,6 +12874,7 @@
         <w:ind w:firstLine="708"/>
       </w:pPr>
       <w:r>
+        <w:lastRenderedPageBreak/>
         <w:t xml:space="preserve"> </w:t>
       </w:r>
       <w:r>
@@ -13130,11 +13107,7 @@
       </w:r>
       <w:proofErr w:type="spellEnd"/>
       <w:r>
-        <w:t xml:space="preserve"> para la generación de informes en </w:t>
-      </w:r>
-      <w:r>
-        <w:lastRenderedPageBreak/>
-        <w:t>PDF, incluyendo una ficha de estudiante, un listado de FEs y un informe estadístico con gráfico de tarta, lo que demuestra la capacidad de integrar herramientas externas en una aplicación JavaFX.</w:t>
+        <w:t xml:space="preserve"> para la generación de informes en PDF, incluyendo una ficha de estudiante, un listado de FEs y un informe estadístico con gráfico de tarta, lo que demuestra la capacidad de integrar herramientas externas en una aplicación JavaFX.</w:t>
       </w:r>
     </w:p>
     <w:p>
@@ -13157,10 +13130,7 @@
         <w:t xml:space="preserve"> y Android SDK.</w:t>
       </w:r>
       <w:r>
-        <w:t xml:space="preserve"> </w:t>
-      </w:r>
-      <w:r>
-        <w:t xml:space="preserve">La aplicación se comunica con la aplicación de escritorio mediante una API REST desarrollada con Spring Boot, usando </w:t>
+        <w:t xml:space="preserve"> La aplicación se comunica con la aplicación de escritorio mediante una API REST desarrollada con Spring Boot, usando </w:t>
       </w:r>
       <w:proofErr w:type="spellStart"/>
       <w:r>
@@ -13182,6 +13152,7 @@
           <w:b/>
           <w:bCs/>
         </w:rPr>
+        <w:lastRenderedPageBreak/>
         <w:t>Programación de Servicios y Procesos</w:t>
       </w:r>
       <w:r>
@@ -13634,7 +13605,6 @@
           <w:b/>
           <w:bCs/>
         </w:rPr>
-        <w:lastRenderedPageBreak/>
         <w:t xml:space="preserve">Sistema operativo Windows 10 o superior. </w:t>
       </w:r>
     </w:p>
@@ -13714,6 +13684,10 @@
         </w:rPr>
       </w:pPr>
       <w:r>
+        <w:rPr>
+          <w:noProof/>
+        </w:rPr>
+        <w:lastRenderedPageBreak/>
         <w:drawing>
           <wp:anchor distT="0" distB="0" distL="114300" distR="114300" simplePos="0" relativeHeight="251445248" behindDoc="0" locked="0" layoutInCell="1" allowOverlap="1" wp14:anchorId="25809452" wp14:editId="0EC2B8E9">
             <wp:simplePos x="0" y="0"/>
@@ -13842,6 +13816,9 @@
         </w:drawing>
       </w:r>
       <w:r>
+        <w:rPr>
+          <w:noProof/>
+        </w:rPr>
         <w:drawing>
           <wp:anchor distT="0" distB="0" distL="114300" distR="114300" simplePos="0" relativeHeight="251457536" behindDoc="0" locked="0" layoutInCell="1" allowOverlap="1" wp14:anchorId="16DB3885" wp14:editId="1BAD9273">
             <wp:simplePos x="0" y="0"/>
@@ -13910,6 +13887,9 @@
     <w:p/>
     <w:p>
       <w:r>
+        <w:rPr>
+          <w:noProof/>
+        </w:rPr>
         <w:drawing>
           <wp:anchor distT="0" distB="0" distL="114300" distR="114300" simplePos="0" relativeHeight="251470848" behindDoc="0" locked="0" layoutInCell="1" allowOverlap="1" wp14:anchorId="3D050C23" wp14:editId="2CCF8132">
             <wp:simplePos x="0" y="0"/>
@@ -14000,6 +13980,9 @@
     </w:p>
     <w:p>
       <w:r>
+        <w:rPr>
+          <w:noProof/>
+        </w:rPr>
         <w:drawing>
           <wp:anchor distT="0" distB="0" distL="114300" distR="114300" simplePos="0" relativeHeight="251472896" behindDoc="0" locked="0" layoutInCell="1" allowOverlap="1" wp14:anchorId="49393318" wp14:editId="7A83C953">
             <wp:simplePos x="0" y="0"/>
@@ -14077,6 +14060,9 @@
     </w:p>
     <w:p>
       <w:r>
+        <w:rPr>
+          <w:noProof/>
+        </w:rPr>
         <w:lastRenderedPageBreak/>
         <w:drawing>
           <wp:anchor distT="0" distB="0" distL="114300" distR="114300" simplePos="0" relativeHeight="251479040" behindDoc="0" locked="0" layoutInCell="1" allowOverlap="1" wp14:anchorId="5F2A8B83" wp14:editId="6C366ED0">
@@ -14244,6 +14230,9 @@
     <w:p/>
     <w:p>
       <w:r>
+        <w:rPr>
+          <w:noProof/>
+        </w:rPr>
         <w:drawing>
           <wp:anchor distT="0" distB="0" distL="114300" distR="114300" simplePos="0" relativeHeight="251492352" behindDoc="0" locked="0" layoutInCell="1" allowOverlap="1" wp14:anchorId="750F4ECC" wp14:editId="0D3CAFF1">
             <wp:simplePos x="0" y="0"/>
@@ -14315,6 +14304,9 @@
     </w:p>
     <w:p>
       <w:r>
+        <w:rPr>
+          <w:noProof/>
+        </w:rPr>
         <w:drawing>
           <wp:anchor distT="0" distB="0" distL="114300" distR="114300" simplePos="0" relativeHeight="251499520" behindDoc="0" locked="0" layoutInCell="1" allowOverlap="1" wp14:anchorId="11F4DE51" wp14:editId="77DDA62B">
             <wp:simplePos x="0" y="0"/>
@@ -14447,6 +14439,9 @@
         </w:drawing>
       </w:r>
       <w:r>
+        <w:rPr>
+          <w:noProof/>
+        </w:rPr>
         <w:drawing>
           <wp:anchor distT="0" distB="0" distL="114300" distR="114300" simplePos="0" relativeHeight="251503616" behindDoc="0" locked="0" layoutInCell="1" allowOverlap="1" wp14:anchorId="511D163D" wp14:editId="140DFE33">
             <wp:simplePos x="0" y="0"/>
@@ -14547,6 +14542,9 @@
     </w:p>
     <w:p>
       <w:r>
+        <w:rPr>
+          <w:noProof/>
+        </w:rPr>
         <w:lastRenderedPageBreak/>
         <w:drawing>
           <wp:anchor distT="0" distB="0" distL="114300" distR="114300" simplePos="0" relativeHeight="251508736" behindDoc="0" locked="0" layoutInCell="1" allowOverlap="1" wp14:anchorId="16790E9D" wp14:editId="5EA6667C">
@@ -14636,6 +14634,9 @@
     </w:p>
     <w:p>
       <w:r>
+        <w:rPr>
+          <w:noProof/>
+        </w:rPr>
         <w:drawing>
           <wp:anchor distT="0" distB="0" distL="114300" distR="114300" simplePos="0" relativeHeight="251516928" behindDoc="0" locked="0" layoutInCell="1" allowOverlap="1" wp14:anchorId="5C737D0F" wp14:editId="6F8BBB89">
             <wp:simplePos x="0" y="0"/>
@@ -14762,6 +14763,9 @@
         </w:drawing>
       </w:r>
       <w:r>
+        <w:rPr>
+          <w:noProof/>
+        </w:rPr>
         <w:drawing>
           <wp:anchor distT="0" distB="0" distL="114300" distR="114300" simplePos="0" relativeHeight="251522048" behindDoc="0" locked="0" layoutInCell="1" allowOverlap="1" wp14:anchorId="27DBDC8B" wp14:editId="6B3F1EC1">
             <wp:simplePos x="0" y="0"/>
@@ -14853,6 +14857,9 @@
     </w:p>
     <w:p>
       <w:r>
+        <w:rPr>
+          <w:noProof/>
+        </w:rPr>
         <w:drawing>
           <wp:anchor distT="0" distB="0" distL="114300" distR="114300" simplePos="0" relativeHeight="251532288" behindDoc="0" locked="0" layoutInCell="1" allowOverlap="1" wp14:anchorId="2ED5AE3B" wp14:editId="20334DDF">
             <wp:simplePos x="0" y="0"/>
@@ -14904,6 +14911,9 @@
         </w:drawing>
       </w:r>
       <w:r>
+        <w:rPr>
+          <w:noProof/>
+        </w:rPr>
         <w:drawing>
           <wp:anchor distT="0" distB="0" distL="114300" distR="114300" simplePos="0" relativeHeight="251536384" behindDoc="0" locked="0" layoutInCell="1" allowOverlap="1" wp14:anchorId="7A5CFACF" wp14:editId="33539967">
             <wp:simplePos x="0" y="0"/>
@@ -14961,6 +14971,9 @@
     <w:p/>
     <w:p>
       <w:r>
+        <w:rPr>
+          <w:noProof/>
+        </w:rPr>
         <w:lastRenderedPageBreak/>
         <w:drawing>
           <wp:anchor distT="0" distB="0" distL="114300" distR="114300" simplePos="0" relativeHeight="251538432" behindDoc="0" locked="0" layoutInCell="1" allowOverlap="1" wp14:anchorId="0CAC350E" wp14:editId="13861809">
@@ -15041,6 +15054,9 @@
     <w:p/>
     <w:p>
       <w:r>
+        <w:rPr>
+          <w:noProof/>
+        </w:rPr>
         <w:drawing>
           <wp:anchor distT="0" distB="0" distL="114300" distR="114300" simplePos="0" relativeHeight="251540480" behindDoc="0" locked="0" layoutInCell="1" allowOverlap="1" wp14:anchorId="55DEEF1A" wp14:editId="528355F9">
             <wp:simplePos x="0" y="0"/>
@@ -15122,6 +15138,7 @@
         <w:rPr>
           <w:b/>
           <w:bCs/>
+          <w:noProof/>
         </w:rPr>
         <w:drawing>
           <wp:anchor distT="0" distB="0" distL="114300" distR="114300" simplePos="0" relativeHeight="251545600" behindDoc="0" locked="0" layoutInCell="1" allowOverlap="1" wp14:anchorId="73E0E411" wp14:editId="5025BAFD">
@@ -15208,6 +15225,9 @@
     <w:p/>
     <w:p>
       <w:r>
+        <w:rPr>
+          <w:noProof/>
+        </w:rPr>
         <w:drawing>
           <wp:anchor distT="0" distB="0" distL="114300" distR="114300" simplePos="0" relativeHeight="251553792" behindDoc="0" locked="0" layoutInCell="1" allowOverlap="1" wp14:anchorId="61C65824" wp14:editId="61ECAFEB">
             <wp:simplePos x="0" y="0"/>
@@ -15309,6 +15329,9 @@
     </w:p>
     <w:p>
       <w:r>
+        <w:rPr>
+          <w:noProof/>
+        </w:rPr>
         <w:drawing>
           <wp:anchor distT="0" distB="0" distL="114300" distR="114300" simplePos="0" relativeHeight="251681796" behindDoc="0" locked="0" layoutInCell="1" allowOverlap="1" wp14:anchorId="7ECE2DF6" wp14:editId="6E44D6AD">
             <wp:simplePos x="0" y="0"/>
@@ -15379,6 +15402,9 @@
     <w:p/>
     <w:p>
       <w:r>
+        <w:rPr>
+          <w:noProof/>
+        </w:rPr>
         <w:lastRenderedPageBreak/>
         <w:drawing>
           <wp:anchor distT="0" distB="0" distL="114300" distR="114300" simplePos="0" relativeHeight="251555840" behindDoc="0" locked="0" layoutInCell="1" allowOverlap="1" wp14:anchorId="7B18BA68" wp14:editId="06F8EE2E">
@@ -15467,6 +15493,9 @@
     <w:p/>
     <w:p>
       <w:r>
+        <w:rPr>
+          <w:noProof/>
+        </w:rPr>
         <w:drawing>
           <wp:anchor distT="0" distB="0" distL="114300" distR="114300" simplePos="0" relativeHeight="251566080" behindDoc="0" locked="0" layoutInCell="1" allowOverlap="1" wp14:anchorId="63782AFA" wp14:editId="555DB516">
             <wp:simplePos x="0" y="0"/>
@@ -15544,6 +15573,9 @@
     <w:p/>
     <w:p>
       <w:r>
+        <w:rPr>
+          <w:noProof/>
+        </w:rPr>
         <w:drawing>
           <wp:anchor distT="0" distB="0" distL="114300" distR="114300" simplePos="0" relativeHeight="251688964" behindDoc="0" locked="0" layoutInCell="1" allowOverlap="1" wp14:anchorId="3605786E" wp14:editId="2AF00788">
             <wp:simplePos x="0" y="0"/>
@@ -15625,6 +15657,9 @@
     <w:p/>
     <w:p>
       <w:r>
+        <w:rPr>
+          <w:noProof/>
+        </w:rPr>
         <w:drawing>
           <wp:anchor distT="0" distB="0" distL="114300" distR="114300" simplePos="0" relativeHeight="251592704" behindDoc="0" locked="0" layoutInCell="1" allowOverlap="1" wp14:anchorId="1C212098" wp14:editId="35C9965E">
             <wp:simplePos x="0" y="0"/>
@@ -15801,6 +15836,9 @@
         </w:drawing>
       </w:r>
       <w:r>
+        <w:rPr>
+          <w:noProof/>
+        </w:rPr>
         <w:drawing>
           <wp:anchor distT="0" distB="0" distL="114300" distR="114300" simplePos="0" relativeHeight="251603968" behindDoc="0" locked="0" layoutInCell="1" allowOverlap="1" wp14:anchorId="31E819BE" wp14:editId="13942BE5">
             <wp:simplePos x="0" y="0"/>
@@ -15886,6 +15924,9 @@
     <w:p/>
     <w:p>
       <w:r>
+        <w:rPr>
+          <w:noProof/>
+        </w:rPr>
         <w:lastRenderedPageBreak/>
         <w:drawing>
           <wp:anchor distT="0" distB="0" distL="114300" distR="114300" simplePos="0" relativeHeight="251585536" behindDoc="0" locked="0" layoutInCell="1" allowOverlap="1" wp14:anchorId="56EFCF44" wp14:editId="778F50C4">
@@ -15969,6 +16010,9 @@
     <w:p/>
     <w:p>
       <w:r>
+        <w:rPr>
+          <w:noProof/>
+        </w:rPr>
         <w:drawing>
           <wp:anchor distT="0" distB="0" distL="114300" distR="114300" simplePos="0" relativeHeight="251579392" behindDoc="0" locked="0" layoutInCell="1" allowOverlap="1" wp14:anchorId="54ABD2FB" wp14:editId="0D6BB1C3">
             <wp:simplePos x="0" y="0"/>
@@ -16050,6 +16094,9 @@
         </w:rPr>
       </w:pPr>
       <w:r>
+        <w:rPr>
+          <w:noProof/>
+        </w:rPr>
         <w:drawing>
           <wp:anchor distT="0" distB="0" distL="114300" distR="114300" simplePos="0" relativeHeight="251613184" behindDoc="0" locked="0" layoutInCell="1" allowOverlap="1" wp14:anchorId="461ECF30" wp14:editId="0924365B">
             <wp:simplePos x="0" y="0"/>
@@ -16175,6 +16222,9 @@
         </w:drawing>
       </w:r>
       <w:r>
+        <w:rPr>
+          <w:noProof/>
+        </w:rPr>
         <w:drawing>
           <wp:anchor distT="0" distB="0" distL="114300" distR="114300" simplePos="0" relativeHeight="251630592" behindDoc="0" locked="0" layoutInCell="1" allowOverlap="1" wp14:anchorId="7C947B0C" wp14:editId="2BF036E6">
             <wp:simplePos x="0" y="0"/>
@@ -16247,8 +16297,11 @@
     </w:p>
     <w:p>
       <w:r>
+        <w:rPr>
+          <w:noProof/>
+        </w:rPr>
         <w:drawing>
-          <wp:anchor distT="0" distB="0" distL="114300" distR="114300" simplePos="0" relativeHeight="251712512" behindDoc="0" locked="0" layoutInCell="1" allowOverlap="1" wp14:anchorId="0C28E433" wp14:editId="001C6600">
+          <wp:anchor distT="0" distB="0" distL="114300" distR="114300" simplePos="0" relativeHeight="251712512" behindDoc="0" locked="0" layoutInCell="1" allowOverlap="1" wp14:anchorId="0C28E433" wp14:editId="07C3384C">
             <wp:simplePos x="0" y="0"/>
             <wp:positionH relativeFrom="column">
               <wp:posOffset>1565748</wp:posOffset>
@@ -16364,6 +16417,9 @@
         </w:drawing>
       </w:r>
       <w:r>
+        <w:rPr>
+          <w:noProof/>
+        </w:rPr>
         <w:drawing>
           <wp:anchor distT="0" distB="0" distL="114300" distR="114300" simplePos="0" relativeHeight="251758592" behindDoc="0" locked="0" layoutInCell="1" allowOverlap="1" wp14:anchorId="7D488855" wp14:editId="73B48390">
             <wp:simplePos x="0" y="0"/>
@@ -16475,8 +16531,11 @@
         </w:drawing>
       </w:r>
       <w:r>
+        <w:rPr>
+          <w:noProof/>
+        </w:rPr>
         <w:drawing>
-          <wp:anchor distT="0" distB="0" distL="114300" distR="114300" simplePos="0" relativeHeight="251663360" behindDoc="0" locked="0" layoutInCell="1" allowOverlap="1" wp14:anchorId="3FF4BB6A" wp14:editId="0966EB84">
+          <wp:anchor distT="0" distB="0" distL="114300" distR="114300" simplePos="0" relativeHeight="251663360" behindDoc="0" locked="0" layoutInCell="1" allowOverlap="1" wp14:anchorId="3FF4BB6A" wp14:editId="35C5FE8D">
             <wp:simplePos x="0" y="0"/>
             <wp:positionH relativeFrom="margin">
               <wp:posOffset>3677004</wp:posOffset>
@@ -16556,6 +16615,9 @@
         <w:jc w:val="both"/>
       </w:pPr>
       <w:r>
+        <w:rPr>
+          <w:noProof/>
+        </w:rPr>
         <w:drawing>
           <wp:anchor distT="0" distB="0" distL="114300" distR="114300" simplePos="0" relativeHeight="251823104" behindDoc="0" locked="0" layoutInCell="1" allowOverlap="1" wp14:anchorId="6CFCEAEA" wp14:editId="34775F20">
             <wp:simplePos x="0" y="0"/>
@@ -16801,10 +16863,11 @@
       </w:r>
       <w:r>
         <w:rPr>
+          <w:noProof/>
           <w:highlight w:val="yellow"/>
         </w:rPr>
         <w:drawing>
-          <wp:anchor distT="0" distB="0" distL="114300" distR="114300" simplePos="0" relativeHeight="251872256" behindDoc="0" locked="0" layoutInCell="1" allowOverlap="1" wp14:anchorId="75A5AA1E" wp14:editId="601271D0">
+          <wp:anchor distT="0" distB="0" distL="114300" distR="114300" simplePos="0" relativeHeight="251872256" behindDoc="0" locked="0" layoutInCell="1" allowOverlap="1" wp14:anchorId="75A5AA1E" wp14:editId="1487B8B7">
             <wp:simplePos x="0" y="0"/>
             <wp:positionH relativeFrom="column">
               <wp:posOffset>194074</wp:posOffset>
@@ -16861,10 +16924,11 @@
       </w:r>
       <w:r>
         <w:rPr>
+          <w:noProof/>
           <w:highlight w:val="yellow"/>
         </w:rPr>
         <w:drawing>
-          <wp:anchor distT="0" distB="0" distL="114300" distR="114300" simplePos="0" relativeHeight="251856896" behindDoc="0" locked="0" layoutInCell="1" allowOverlap="1" wp14:anchorId="50DE4BDA" wp14:editId="596DB054">
+          <wp:anchor distT="0" distB="0" distL="114300" distR="114300" simplePos="0" relativeHeight="251856896" behindDoc="0" locked="0" layoutInCell="1" allowOverlap="1" wp14:anchorId="50DE4BDA" wp14:editId="70194562">
             <wp:simplePos x="0" y="0"/>
             <wp:positionH relativeFrom="column">
               <wp:posOffset>3372795</wp:posOffset>
@@ -16921,10 +16985,11 @@
       </w:r>
       <w:r>
         <w:rPr>
+          <w:noProof/>
           <w:highlight w:val="yellow"/>
         </w:rPr>
         <w:drawing>
-          <wp:anchor distT="0" distB="0" distL="114300" distR="114300" simplePos="0" relativeHeight="251838464" behindDoc="0" locked="0" layoutInCell="1" allowOverlap="1" wp14:anchorId="6E392A9D" wp14:editId="50BC0DE3">
+          <wp:anchor distT="0" distB="0" distL="114300" distR="114300" simplePos="0" relativeHeight="251838464" behindDoc="0" locked="0" layoutInCell="1" allowOverlap="1" wp14:anchorId="6E392A9D" wp14:editId="2AF0B9EB">
             <wp:simplePos x="0" y="0"/>
             <wp:positionH relativeFrom="margin">
               <wp:align>left</wp:align>
@@ -18772,6 +18837,7 @@
   <w:style w:type="character" w:default="1" w:styleId="Fuentedeprrafopredeter">
     <w:name w:val="Default Paragraph Font"/>
     <w:uiPriority w:val="1"/>
+    <w:semiHidden/>
     <w:unhideWhenUsed/>
   </w:style>
   <w:style w:type="table" w:default="1" w:styleId="Tablanormal">
@@ -19920,6 +19986,14 @@
 </file>
 
 <file path=customXml/item1.xml><?xml version="1.0" encoding="utf-8"?>
+<p:properties xmlns:p="http://schemas.microsoft.com/office/2006/metadata/properties" xmlns:xsi="http://www.w3.org/2001/XMLSchema-instance" xmlns:pc="http://schemas.microsoft.com/office/infopath/2007/PartnerControls">
+  <documentManagement>
+    <_activity xmlns="d07641f9-f1a5-43c1-ac16-fa53e6c318bc" xsi:nil="true"/>
+  </documentManagement>
+</p:properties>
+</file>
+
+<file path=customXml/item2.xml><?xml version="1.0" encoding="utf-8"?>
 <?mso-contentType ?>
 <FormTemplates xmlns="http://schemas.microsoft.com/sharepoint/v3/contenttype/forms">
   <Display>DocumentLibraryForm</Display>
@@ -19928,19 +20002,7 @@
 </FormTemplates>
 </file>
 
-<file path=customXml/item2.xml><?xml version="1.0" encoding="utf-8"?>
-<b:Sources xmlns:b="http://schemas.openxmlformats.org/officeDocument/2006/bibliography" xmlns="http://schemas.openxmlformats.org/officeDocument/2006/bibliography" SelectedStyle="\APASixthEditionOfficeOnline.xsl" StyleName="APA" Version="6"/>
-</file>
-
 <file path=customXml/item3.xml><?xml version="1.0" encoding="utf-8"?>
-<p:properties xmlns:p="http://schemas.microsoft.com/office/2006/metadata/properties" xmlns:xsi="http://www.w3.org/2001/XMLSchema-instance" xmlns:pc="http://schemas.microsoft.com/office/infopath/2007/PartnerControls">
-  <documentManagement>
-    <_activity xmlns="d07641f9-f1a5-43c1-ac16-fa53e6c318bc" xsi:nil="true"/>
-  </documentManagement>
-</p:properties>
-</file>
-
-<file path=customXml/item4.xml><?xml version="1.0" encoding="utf-8"?>
 <ct:contentTypeSchema xmlns:ct="http://schemas.microsoft.com/office/2006/metadata/contentType" xmlns:ma="http://schemas.microsoft.com/office/2006/metadata/properties/metaAttributes" ct:_="" ma:_="" ma:contentTypeName="Documento" ma:contentTypeID="0x010100089FBA7B0FAFA84E9F1E615D3FC0A129" ma:contentTypeVersion="11" ma:contentTypeDescription="Crear nuevo documento." ma:contentTypeScope="" ma:versionID="fa55cfaacbcd603bd53d850e3b8176f7">
   <xsd:schema xmlns:xsd="http://www.w3.org/2001/XMLSchema" xmlns:xs="http://www.w3.org/2001/XMLSchema" xmlns:p="http://schemas.microsoft.com/office/2006/metadata/properties" xmlns:ns3="d07641f9-f1a5-43c1-ac16-fa53e6c318bc" targetNamespace="http://schemas.microsoft.com/office/2006/metadata/properties" ma:root="true" ma:fieldsID="78f989df160fe6a5ee2e0e0b0bfde0e3" ns3:_="">
     <xsd:import namespace="d07641f9-f1a5-43c1-ac16-fa53e6c318bc"/>
@@ -20128,23 +20190,11 @@
 </ct:contentTypeSchema>
 </file>
 
-<file path=customXml/itemProps1.xml><?xml version="1.0" encoding="utf-8"?>
-<ds:datastoreItem xmlns:ds="http://schemas.openxmlformats.org/officeDocument/2006/customXml" ds:itemID="{480B8420-1B48-4D23-8D6E-64373AC5070B}">
-  <ds:schemaRefs>
-    <ds:schemaRef ds:uri="http://schemas.microsoft.com/sharepoint/v3/contenttype/forms"/>
-  </ds:schemaRefs>
-</ds:datastoreItem>
+<file path=customXml/item4.xml><?xml version="1.0" encoding="utf-8"?>
+<b:Sources xmlns:b="http://schemas.openxmlformats.org/officeDocument/2006/bibliography" xmlns="http://schemas.openxmlformats.org/officeDocument/2006/bibliography" SelectedStyle="\APASixthEditionOfficeOnline.xsl" StyleName="APA" Version="6"/>
 </file>
 
-<file path=customXml/itemProps2.xml><?xml version="1.0" encoding="utf-8"?>
-<ds:datastoreItem xmlns:ds="http://schemas.openxmlformats.org/officeDocument/2006/customXml" ds:itemID="{453714F8-FBC3-4DCC-8DCB-89BB58DCF76F}">
-  <ds:schemaRefs>
-    <ds:schemaRef ds:uri="http://schemas.openxmlformats.org/officeDocument/2006/bibliography"/>
-  </ds:schemaRefs>
-</ds:datastoreItem>
-</file>
-
-<file path=customXml/itemProps3.xml><?xml version="1.0" encoding="utf-8"?>
+<file path=customXml/itemProps1.xml><?xml version="1.0" encoding="utf-8"?>
 <ds:datastoreItem xmlns:ds="http://schemas.openxmlformats.org/officeDocument/2006/customXml" ds:itemID="{7F0B1298-25D5-45B9-909D-DD837044A49E}">
   <ds:schemaRefs>
     <ds:schemaRef ds:uri="http://schemas.microsoft.com/office/2006/metadata/properties"/>
@@ -20154,7 +20204,15 @@
 </ds:datastoreItem>
 </file>
 
-<file path=customXml/itemProps4.xml><?xml version="1.0" encoding="utf-8"?>
+<file path=customXml/itemProps2.xml><?xml version="1.0" encoding="utf-8"?>
+<ds:datastoreItem xmlns:ds="http://schemas.openxmlformats.org/officeDocument/2006/customXml" ds:itemID="{480B8420-1B48-4D23-8D6E-64373AC5070B}">
+  <ds:schemaRefs>
+    <ds:schemaRef ds:uri="http://schemas.microsoft.com/sharepoint/v3/contenttype/forms"/>
+  </ds:schemaRefs>
+</ds:datastoreItem>
+</file>
+
+<file path=customXml/itemProps3.xml><?xml version="1.0" encoding="utf-8"?>
 <ds:datastoreItem xmlns:ds="http://schemas.openxmlformats.org/officeDocument/2006/customXml" ds:itemID="{B3C09D93-2BDC-4563-9759-9158244E5DE7}">
   <ds:schemaRefs>
     <ds:schemaRef ds:uri="http://schemas.microsoft.com/office/2006/metadata/contentType"/>
@@ -20170,4 +20228,12 @@
     <ds:schemaRef ds:uri="http://schemas.microsoft.com/internal/obd"/>
   </ds:schemaRefs>
 </ds:datastoreItem>
+</file>
+
+<file path=customXml/itemProps4.xml><?xml version="1.0" encoding="utf-8"?>
+<ds:datastoreItem xmlns:ds="http://schemas.openxmlformats.org/officeDocument/2006/customXml" ds:itemID="{453714F8-FBC3-4DCC-8DCB-89BB58DCF76F}">
+  <ds:schemaRefs>
+    <ds:schemaRef ds:uri="http://schemas.openxmlformats.org/officeDocument/2006/bibliography"/>
+  </ds:schemaRefs>
+</ds:datastoreItem>
 </file>
</xml_diff>